<commit_message>
style(docs): update Word doc to light theme on-brand
- Table headers now use cement (#E6E6E1) background
- Black text throughout (no dark headers with white text)
- Clean, minimal light-theme aesthetic

Co-Authored-By: Claude Opus 4.5 <noreply@anthropic.com>
</commit_message>
<xml_diff>
--- a/docs/STARK_Procurement_Scope_Document_Kim_Christensen.docx
+++ b/docs/STARK_Procurement_Scope_Document_Kim_Christensen.docx
@@ -445,13 +445,13 @@
         <w:tc>
           <w:tcPr>
             <w:tcW w:type="dxa" w:w="1728"/>
-            <w:shd w:fill="333333"/>
+            <w:shd w:fill="E6E6E1"/>
           </w:tcPr>
           <w:p>
             <w:r>
               <w:rPr>
                 <w:b/>
-                <w:color w:val="FFFFFF"/>
+                <w:color w:val="000000"/>
               </w:rPr>
               <w:t>Aspect</w:t>
             </w:r>
@@ -460,13 +460,13 @@
         <w:tc>
           <w:tcPr>
             <w:tcW w:type="dxa" w:w="1728"/>
-            <w:shd w:fill="333333"/>
+            <w:shd w:fill="E6E6E1"/>
           </w:tcPr>
           <w:p>
             <w:r>
               <w:rPr>
                 <w:b/>
-                <w:color w:val="FFFFFF"/>
+                <w:color w:val="000000"/>
               </w:rPr>
               <w:t>Low-Code</w:t>
             </w:r>
@@ -475,13 +475,13 @@
         <w:tc>
           <w:tcPr>
             <w:tcW w:type="dxa" w:w="1728"/>
-            <w:shd w:fill="333333"/>
+            <w:shd w:fill="E6E6E1"/>
           </w:tcPr>
           <w:p>
             <w:r>
               <w:rPr>
                 <w:b/>
-                <w:color w:val="FFFFFF"/>
+                <w:color w:val="000000"/>
               </w:rPr>
               <w:t>Vibecoding</w:t>
             </w:r>
@@ -490,13 +490,13 @@
         <w:tc>
           <w:tcPr>
             <w:tcW w:type="dxa" w:w="1728"/>
-            <w:shd w:fill="333333"/>
+            <w:shd w:fill="E6E6E1"/>
           </w:tcPr>
           <w:p>
             <w:r>
               <w:rPr>
                 <w:b/>
-                <w:color w:val="FFFFFF"/>
+                <w:color w:val="000000"/>
               </w:rPr>
               <w:t>Traditional</w:t>
             </w:r>
@@ -505,13 +505,13 @@
         <w:tc>
           <w:tcPr>
             <w:tcW w:type="dxa" w:w="1728"/>
-            <w:shd w:fill="333333"/>
+            <w:shd w:fill="E6E6E1"/>
           </w:tcPr>
           <w:p>
             <w:r>
               <w:rPr>
                 <w:b/>
-                <w:color w:val="FFFFFF"/>
+                <w:color w:val="000000"/>
               </w:rPr>
               <w:t>Agentic Engineering</w:t>
             </w:r>
@@ -1289,13 +1289,13 @@
         <w:tc>
           <w:tcPr>
             <w:tcW w:type="dxa" w:w="4320"/>
-            <w:shd w:fill="333333"/>
+            <w:shd w:fill="E6E6E1"/>
           </w:tcPr>
           <w:p>
             <w:r>
               <w:rPr>
                 <w:b/>
-                <w:color w:val="FFFFFF"/>
+                <w:color w:val="000000"/>
               </w:rPr>
               <w:t>Metric</w:t>
             </w:r>
@@ -1304,13 +1304,13 @@
         <w:tc>
           <w:tcPr>
             <w:tcW w:type="dxa" w:w="4320"/>
-            <w:shd w:fill="333333"/>
+            <w:shd w:fill="E6E6E1"/>
           </w:tcPr>
           <w:p>
             <w:r>
               <w:rPr>
                 <w:b/>
-                <w:color w:val="FFFFFF"/>
+                <w:color w:val="000000"/>
               </w:rPr>
               <w:t>Annual Volume</w:t>
             </w:r>
@@ -1478,13 +1478,13 @@
         <w:tc>
           <w:tcPr>
             <w:tcW w:type="dxa" w:w="2880"/>
-            <w:shd w:fill="333333"/>
+            <w:shd w:fill="E6E6E1"/>
           </w:tcPr>
           <w:p>
             <w:r>
               <w:rPr>
                 <w:b/>
-                <w:color w:val="FFFFFF"/>
+                <w:color w:val="000000"/>
               </w:rPr>
               <w:t>Role</w:t>
             </w:r>
@@ -1493,13 +1493,13 @@
         <w:tc>
           <w:tcPr>
             <w:tcW w:type="dxa" w:w="2880"/>
-            <w:shd w:fill="333333"/>
+            <w:shd w:fill="E6E6E1"/>
           </w:tcPr>
           <w:p>
             <w:r>
               <w:rPr>
                 <w:b/>
-                <w:color w:val="FFFFFF"/>
+                <w:color w:val="000000"/>
               </w:rPr>
               <w:t>Count (est.)</w:t>
             </w:r>
@@ -1508,13 +1508,13 @@
         <w:tc>
           <w:tcPr>
             <w:tcW w:type="dxa" w:w="2880"/>
-            <w:shd w:fill="333333"/>
+            <w:shd w:fill="E6E6E1"/>
           </w:tcPr>
           <w:p>
             <w:r>
               <w:rPr>
                 <w:b/>
-                <w:color w:val="FFFFFF"/>
+                <w:color w:val="000000"/>
               </w:rPr>
               <w:t>Primary Function</w:t>
             </w:r>
@@ -1858,13 +1858,13 @@
         <w:tc>
           <w:tcPr>
             <w:tcW w:type="dxa" w:w="2880"/>
-            <w:shd w:fill="333333"/>
+            <w:shd w:fill="E6E6E1"/>
           </w:tcPr>
           <w:p>
             <w:r>
               <w:rPr>
                 <w:b/>
-                <w:color w:val="FFFFFF"/>
+                <w:color w:val="000000"/>
               </w:rPr>
               <w:t>Screen ID</w:t>
             </w:r>
@@ -1873,13 +1873,13 @@
         <w:tc>
           <w:tcPr>
             <w:tcW w:type="dxa" w:w="2880"/>
-            <w:shd w:fill="333333"/>
+            <w:shd w:fill="E6E6E1"/>
           </w:tcPr>
           <w:p>
             <w:r>
               <w:rPr>
                 <w:b/>
-                <w:color w:val="FFFFFF"/>
+                <w:color w:val="000000"/>
               </w:rPr>
               <w:t>Name</w:t>
             </w:r>
@@ -1888,13 +1888,13 @@
         <w:tc>
           <w:tcPr>
             <w:tcW w:type="dxa" w:w="2880"/>
-            <w:shd w:fill="333333"/>
+            <w:shd w:fill="E6E6E1"/>
           </w:tcPr>
           <w:p>
             <w:r>
               <w:rPr>
                 <w:b/>
-                <w:color w:val="FFFFFF"/>
+                <w:color w:val="000000"/>
               </w:rPr>
               <w:t>Purpose</w:t>
             </w:r>
@@ -2710,13 +2710,13 @@
         <w:tc>
           <w:tcPr>
             <w:tcW w:type="dxa" w:w="2880"/>
-            <w:shd w:fill="333333"/>
+            <w:shd w:fill="E6E6E1"/>
           </w:tcPr>
           <w:p>
             <w:r>
               <w:rPr>
                 <w:b/>
-                <w:color w:val="FFFFFF"/>
+                <w:color w:val="000000"/>
               </w:rPr>
               <w:t>Source</w:t>
             </w:r>
@@ -2725,13 +2725,13 @@
         <w:tc>
           <w:tcPr>
             <w:tcW w:type="dxa" w:w="2880"/>
-            <w:shd w:fill="333333"/>
+            <w:shd w:fill="E6E6E1"/>
           </w:tcPr>
           <w:p>
             <w:r>
               <w:rPr>
                 <w:b/>
-                <w:color w:val="FFFFFF"/>
+                <w:color w:val="000000"/>
               </w:rPr>
               <w:t>Topic</w:t>
             </w:r>
@@ -2740,13 +2740,13 @@
         <w:tc>
           <w:tcPr>
             <w:tcW w:type="dxa" w:w="2880"/>
-            <w:shd w:fill="333333"/>
+            <w:shd w:fill="E6E6E1"/>
           </w:tcPr>
           <w:p>
             <w:r>
               <w:rPr>
                 <w:b/>
-                <w:color w:val="FFFFFF"/>
+                <w:color w:val="000000"/>
               </w:rPr>
               <w:t>Consumer</w:t>
             </w:r>
@@ -2909,13 +2909,13 @@
         <w:tc>
           <w:tcPr>
             <w:tcW w:type="dxa" w:w="2880"/>
-            <w:shd w:fill="333333"/>
+            <w:shd w:fill="E6E6E1"/>
           </w:tcPr>
           <w:p>
             <w:r>
               <w:rPr>
                 <w:b/>
-                <w:color w:val="FFFFFF"/>
+                <w:color w:val="000000"/>
               </w:rPr>
               <w:t>Channel</w:t>
             </w:r>
@@ -2924,13 +2924,13 @@
         <w:tc>
           <w:tcPr>
             <w:tcW w:type="dxa" w:w="2880"/>
-            <w:shd w:fill="333333"/>
+            <w:shd w:fill="E6E6E1"/>
           </w:tcPr>
           <w:p>
             <w:r>
               <w:rPr>
                 <w:b/>
-                <w:color w:val="FFFFFF"/>
+                <w:color w:val="000000"/>
               </w:rPr>
               <w:t>Topic</w:t>
             </w:r>
@@ -2939,13 +2939,13 @@
         <w:tc>
           <w:tcPr>
             <w:tcW w:type="dxa" w:w="2880"/>
-            <w:shd w:fill="333333"/>
+            <w:shd w:fill="E6E6E1"/>
           </w:tcPr>
           <w:p>
             <w:r>
               <w:rPr>
                 <w:b/>
-                <w:color w:val="FFFFFF"/>
+                <w:color w:val="000000"/>
               </w:rPr>
               <w:t>Consumer</w:t>
             </w:r>
@@ -3099,13 +3099,13 @@
         <w:tc>
           <w:tcPr>
             <w:tcW w:type="dxa" w:w="2880"/>
-            <w:shd w:fill="333333"/>
+            <w:shd w:fill="E6E6E1"/>
           </w:tcPr>
           <w:p>
             <w:r>
               <w:rPr>
                 <w:b/>
-                <w:color w:val="FFFFFF"/>
+                <w:color w:val="000000"/>
               </w:rPr>
               <w:t>Item</w:t>
             </w:r>
@@ -3114,13 +3114,13 @@
         <w:tc>
           <w:tcPr>
             <w:tcW w:type="dxa" w:w="2880"/>
-            <w:shd w:fill="333333"/>
+            <w:shd w:fill="E6E6E1"/>
           </w:tcPr>
           <w:p>
             <w:r>
               <w:rPr>
                 <w:b/>
-                <w:color w:val="FFFFFF"/>
+                <w:color w:val="000000"/>
               </w:rPr>
               <w:t>Reason</w:t>
             </w:r>
@@ -3129,13 +3129,13 @@
         <w:tc>
           <w:tcPr>
             <w:tcW w:type="dxa" w:w="2880"/>
-            <w:shd w:fill="333333"/>
+            <w:shd w:fill="E6E6E1"/>
           </w:tcPr>
           <w:p>
             <w:r>
               <w:rPr>
                 <w:b/>
-                <w:color w:val="FFFFFF"/>
+                <w:color w:val="000000"/>
               </w:rPr>
               <w:t>Future Phase</w:t>
             </w:r>
@@ -3780,13 +3780,13 @@
         <w:tc>
           <w:tcPr>
             <w:tcW w:type="dxa" w:w="2880"/>
-            <w:shd w:fill="333333"/>
+            <w:shd w:fill="E6E6E1"/>
           </w:tcPr>
           <w:p>
             <w:r>
               <w:rPr>
                 <w:b/>
-                <w:color w:val="FFFFFF"/>
+                <w:color w:val="000000"/>
               </w:rPr>
               <w:t>Item</w:t>
             </w:r>
@@ -3795,13 +3795,13 @@
         <w:tc>
           <w:tcPr>
             <w:tcW w:type="dxa" w:w="2880"/>
-            <w:shd w:fill="333333"/>
+            <w:shd w:fill="E6E6E1"/>
           </w:tcPr>
           <w:p>
             <w:r>
               <w:rPr>
                 <w:b/>
-                <w:color w:val="FFFFFF"/>
+                <w:color w:val="000000"/>
               </w:rPr>
               <w:t>Vendor</w:t>
             </w:r>
@@ -3810,13 +3810,13 @@
         <w:tc>
           <w:tcPr>
             <w:tcW w:type="dxa" w:w="2880"/>
-            <w:shd w:fill="333333"/>
+            <w:shd w:fill="E6E6E1"/>
           </w:tcPr>
           <w:p>
             <w:r>
               <w:rPr>
                 <w:b/>
-                <w:color w:val="FFFFFF"/>
+                <w:color w:val="000000"/>
               </w:rPr>
               <w:t>STARK</w:t>
             </w:r>

</xml_diff>

<commit_message>
fix(docs): correct ADAPT methodology definition
ADAPT = Agentic Development with Artifact Persistence & Testing
- Agentic: AI agents on well-defined tasks
- Development: Production-grade engineering
- Artifact: Persisted knowledge stores
- Persistence: Session continuity
- Testing: Test-gated task completion

Co-Authored-By: Claude Opus 4.5 <noreply@anthropic.com>
</commit_message>
<xml_diff>
--- a/docs/STARK_Procurement_Scope_Document_Kim_Christensen.docx
+++ b/docs/STARK_Procurement_Scope_Document_Kim_Christensen.docx
@@ -811,7 +811,21 @@
         <w:spacing w:after="240"/>
       </w:pPr>
       <w:r>
-        <w:t>Our delivery follows the ADAPT methodology—a structured approach that ensures quality at speed:</w:t>
+        <w:rPr>
+          <w:b/>
+        </w:rPr>
+        <w:t xml:space="preserve">ADAPT: </w:t>
+      </w:r>
+      <w:r>
+        <w:t>Agentic Development with Artifact Persistence &amp; Testing</w:t>
+      </w:r>
+    </w:p>
+    <w:p>
+      <w:pPr>
+        <w:spacing w:after="240"/>
+      </w:pPr>
+      <w:r>
+        <w:t>ADAPT is a methodology for AI-assisted software delivery that ensures knowledge compounds across sessions, quality is enforced through test-gated tasks, and work is structured for maximum parallelization.</w:t>
       </w:r>
     </w:p>
     <w:p>
@@ -823,10 +837,10 @@
         <w:rPr>
           <w:b/>
         </w:rPr>
-        <w:t xml:space="preserve">A — Assess: </w:t>
+        <w:t xml:space="preserve">Agentic: </w:t>
       </w:r>
       <w:r>
-        <w:t>Deep understanding of requirements, existing systems, and constraints before writing any code.</w:t>
+        <w:t>AI agents work autonomously on well-defined tasks within clear boundaries. Human engineers set direction, review output, and make architectural decisions.</w:t>
       </w:r>
     </w:p>
     <w:p>
@@ -838,10 +852,10 @@
         <w:rPr>
           <w:b/>
         </w:rPr>
-        <w:t xml:space="preserve">D — Design: </w:t>
+        <w:t xml:space="preserve">Development: </w:t>
       </w:r>
       <w:r>
-        <w:t>Architecture decisions documented and reviewed. No 'figure it out as we go.'</w:t>
+        <w:t>Real engineering—not prototyping. Production-grade code with proper error handling, type safety, and maintainability.</w:t>
       </w:r>
     </w:p>
     <w:p>
@@ -853,10 +867,10 @@
         <w:rPr>
           <w:b/>
         </w:rPr>
-        <w:t xml:space="preserve">A — Assemble: </w:t>
+        <w:t xml:space="preserve">Artifact: </w:t>
       </w:r>
       <w:r>
-        <w:t>AI-assisted code generation under engineer supervision. Every line reviewed.</w:t>
+        <w:t>Every decision, lesson, and context is persisted in structured knowledge stores. Nothing is lost between sessions.</w:t>
       </w:r>
     </w:p>
     <w:p>
@@ -868,10 +882,10 @@
         <w:rPr>
           <w:b/>
         </w:rPr>
-        <w:t xml:space="preserve">P — Prove: </w:t>
+        <w:t xml:space="preserve">Persistence: </w:t>
       </w:r>
       <w:r>
-        <w:t>Comprehensive testing, security review, and validation against requirements.</w:t>
+        <w:t>Session continuity through shared context logs, lessons learned, and development diaries. The next session picks up exactly where this one left off.</w:t>
       </w:r>
     </w:p>
     <w:p>
@@ -883,10 +897,10 @@
         <w:rPr>
           <w:b/>
         </w:rPr>
-        <w:t xml:space="preserve">T — Transfer: </w:t>
+        <w:t xml:space="preserve">Testing: </w:t>
       </w:r>
       <w:r>
-        <w:t>Full documentation, walkthrough, and knowledge transfer. You own the code.</w:t>
+        <w:t>Test-gated task completion. No task is marked done until tests pass. Quality is enforced, not hoped for.</w:t>
       </w:r>
     </w:p>
     <w:p>

</xml_diff>

<commit_message>
fix(docs): clarify Agentic Engineering vs AI-assisted development
Agentic Engineering is NOT AI-assisted development:
- AI-assisted: humans write code with AI suggestions
- Agentic: agents autonomously execute, humans direct and review

"Agents do the work. Humans set the direction."

Co-Authored-By: Claude Opus 4.5 <noreply@anthropic.com>
</commit_message>
<xml_diff>
--- a/docs/STARK_Procurement_Scope_Document_Kim_Christensen.docx
+++ b/docs/STARK_Procurement_Scope_Document_Kim_Christensen.docx
@@ -103,7 +103,7 @@
         <w:rPr>
           <w:color w:val="000000"/>
         </w:rPr>
-        <w:t>Our Approach: Engineering Excellence at Speed</w:t>
+        <w:t>Our Approach: Agentic Engineering</w:t>
       </w:r>
     </w:p>
     <w:p>
@@ -111,7 +111,15 @@
         <w:spacing w:after="240"/>
       </w:pPr>
       <w:r>
-        <w:t>At Agentic Agency, we believe in a fundamental truth: great software comes from great engineering, not from shortcuts. We've pioneered a delivery model that combines the speed of modern AI-assisted development with the rigor and quality of traditional software craftsmanship. The result is exceptional software delivered in compressed timelines—without compromise.</w:t>
+        <w:t>At Agentic Agency, we practice Agentic Engineering—a fundamentally different approach to software delivery. This is not 'AI-assisted development' where humans write code with AI suggestions. This is AI agents autonomously executing engineering tasks under human direction and review.</w:t>
+      </w:r>
+    </w:p>
+    <w:p>
+      <w:pPr>
+        <w:spacing w:after="240"/>
+      </w:pPr>
+      <w:r>
+        <w:t>The result is engineering excellence at speed: production-grade software with proper architecture, comprehensive testing, and maintainable code—delivered in compressed timelines because agents work continuously while humans focus on what matters: direction, constraints, and quality gates.</w:t>
       </w:r>
     </w:p>
     <w:p>
@@ -133,10 +141,10 @@
         <w:rPr>
           <w:b/>
         </w:rPr>
-        <w:t xml:space="preserve">Quality Without Compromise: </w:t>
+        <w:t xml:space="preserve">Engineering, Not Prompting: </w:t>
       </w:r>
       <w:r>
-        <w:t>We write code that you would be proud to show your best engineers. Clean, maintainable, well-tested, and documented.</w:t>
+        <w:t>We deliver engineered systems, not prompt-generated artifacts. Architecture, testing, documentation—all first-class concerns.</w:t>
       </w:r>
     </w:p>
     <w:p>
@@ -147,10 +155,10 @@
         <w:rPr>
           <w:b/>
         </w:rPr>
-        <w:t xml:space="preserve">Speed Through Intelligence: </w:t>
+        <w:t xml:space="preserve">Agents Under Direction: </w:t>
       </w:r>
       <w:r>
-        <w:t>We leverage AI as a force multiplier for skilled engineers—not as a replacement for engineering judgment.</w:t>
+        <w:t>AI agents execute autonomously within boundaries set by experienced engineers. Human judgment shapes every deliverable.</w:t>
       </w:r>
     </w:p>
     <w:p>
@@ -399,7 +407,7 @@
         <w:spacing w:after="240"/>
       </w:pPr>
       <w:r>
-        <w:t>Agentic Engineering is neither low-code, nor vibecoding, nor traditional development. It represents a new paradigm where AI augments—rather than replaces—expert human judgment.</w:t>
+        <w:t>Agentic Engineering is neither low-code, nor vibecoding, nor AI-assisted development. It is a new paradigm where AI agents autonomously execute engineering tasks—writing code, running tests, fixing bugs, documenting decisions—while humans provide direction, constraints, and quality review.</w:t>
       </w:r>
     </w:p>
     <w:p>
@@ -413,7 +421,7 @@
         <w:t xml:space="preserve">The Core Principle: </w:t>
       </w:r>
       <w:r>
-        <w:t>Skilled engineers remain in the loop at every decision point. AI handles the mechanical aspects of code generation, pattern matching, and documentation—freeing engineers to focus on architecture, edge cases, security, and the nuanced decisions that determine software quality.</w:t>
+        <w:t>Agents do the work. Humans set the direction. Engineers define architecture, acceptance criteria, and quality gates. Agents execute autonomously within those boundaries—working in parallel, around the clock, with full persistence of context and decisions across sessions.</w:t>
       </w:r>
     </w:p>
     <w:p>
@@ -825,7 +833,7 @@
         <w:spacing w:after="240"/>
       </w:pPr>
       <w:r>
-        <w:t>ADAPT is a methodology for AI-assisted software delivery that ensures knowledge compounds across sessions, quality is enforced through test-gated tasks, and work is structured for maximum parallelization.</w:t>
+        <w:t>ADAPT is our methodology for Agentic Engineering: knowledge compounds across sessions, quality is enforced through test-gated tasks, and work is structured for maximum agent parallelization.</w:t>
       </w:r>
     </w:p>
     <w:p>

</xml_diff>

<commit_message>
fix(docs): replace unicode line breaks with proper Word borders
Use paragraph bottom borders instead of repeated ─ characters
for cleaner section dividers in Word

Co-Authored-By: Claude Opus 4.5 <noreply@anthropic.com>
</commit_message>
<xml_diff>
--- a/docs/STARK_Procurement_Scope_Document_Kim_Christensen.docx
+++ b/docs/STARK_Procurement_Scope_Document_Kim_Christensen.docx
@@ -191,15 +191,11 @@
     </w:p>
     <w:p>
       <w:pPr>
-        <w:spacing w:after="240"/>
-      </w:pPr>
-      <w:r>
-        <w:rPr>
-          <w:color w:val="666666"/>
-          <w:sz w:val="16"/>
-        </w:rPr>
-        <w:t>────────────────────────────────────────────────────────────────────────────────</w:t>
-      </w:r>
+        <w:spacing w:before="360" w:after="360"/>
+        <w:pBdr>
+          <w:bottom w:val="single" w:sz="6" w:space="1" w:color="999999"/>
+        </w:pBdr>
+      </w:pPr>
     </w:p>
     <w:p>
       <w:pPr>
@@ -381,15 +377,11 @@
     </w:p>
     <w:p>
       <w:pPr>
-        <w:spacing w:after="240"/>
-      </w:pPr>
-      <w:r>
-        <w:rPr>
-          <w:color w:val="666666"/>
-          <w:sz w:val="16"/>
-        </w:rPr>
-        <w:t>────────────────────────────────────────────────────────────────────────────────</w:t>
-      </w:r>
+        <w:spacing w:before="360" w:after="360"/>
+        <w:pBdr>
+          <w:bottom w:val="single" w:sz="6" w:space="1" w:color="999999"/>
+        </w:pBdr>
+      </w:pPr>
     </w:p>
     <w:p>
       <w:pPr>
@@ -913,15 +905,11 @@
     </w:p>
     <w:p>
       <w:pPr>
-        <w:spacing w:after="240"/>
-      </w:pPr>
-      <w:r>
-        <w:rPr>
-          <w:color w:val="666666"/>
-          <w:sz w:val="16"/>
-        </w:rPr>
-        <w:t>────────────────────────────────────────────────────────────────────────────────</w:t>
-      </w:r>
+        <w:spacing w:before="360" w:after="360"/>
+        <w:pBdr>
+          <w:bottom w:val="single" w:sz="6" w:space="1" w:color="999999"/>
+        </w:pBdr>
+      </w:pPr>
     </w:p>
     <w:p>
       <w:pPr>
@@ -983,15 +971,11 @@
     </w:p>
     <w:p>
       <w:pPr>
-        <w:spacing w:after="240"/>
-      </w:pPr>
-      <w:r>
-        <w:rPr>
-          <w:color w:val="666666"/>
-          <w:sz w:val="16"/>
-        </w:rPr>
-        <w:t>────────────────────────────────────────────────────────────────────────────────</w:t>
-      </w:r>
+        <w:spacing w:before="360" w:after="360"/>
+        <w:pBdr>
+          <w:bottom w:val="single" w:sz="6" w:space="1" w:color="999999"/>
+        </w:pBdr>
+      </w:pPr>
     </w:p>
     <w:p>
       <w:pPr>
@@ -1090,15 +1074,11 @@
     </w:p>
     <w:p>
       <w:pPr>
-        <w:spacing w:after="240"/>
-      </w:pPr>
-      <w:r>
-        <w:rPr>
-          <w:color w:val="666666"/>
-          <w:sz w:val="16"/>
-        </w:rPr>
-        <w:t>────────────────────────────────────────────────────────────────────────────────</w:t>
-      </w:r>
+        <w:spacing w:before="360" w:after="360"/>
+        <w:pBdr>
+          <w:bottom w:val="single" w:sz="6" w:space="1" w:color="999999"/>
+        </w:pBdr>
+      </w:pPr>
     </w:p>
     <w:p>
       <w:pPr>
@@ -1178,15 +1158,11 @@
     </w:p>
     <w:p>
       <w:pPr>
-        <w:spacing w:after="240"/>
-      </w:pPr>
-      <w:r>
-        <w:rPr>
-          <w:color w:val="666666"/>
-          <w:sz w:val="16"/>
-        </w:rPr>
-        <w:t>────────────────────────────────────────────────────────────────────────────────</w:t>
-      </w:r>
+        <w:spacing w:before="360" w:after="360"/>
+        <w:pBdr>
+          <w:bottom w:val="single" w:sz="6" w:space="1" w:color="999999"/>
+        </w:pBdr>
+      </w:pPr>
     </w:p>
     <w:p>
       <w:pPr>
@@ -1453,15 +1429,11 @@
     <w:p/>
     <w:p>
       <w:pPr>
-        <w:spacing w:after="240"/>
-      </w:pPr>
-      <w:r>
-        <w:rPr>
-          <w:color w:val="666666"/>
-          <w:sz w:val="16"/>
-        </w:rPr>
-        <w:t>────────────────────────────────────────────────────────────────────────────────</w:t>
-      </w:r>
+        <w:spacing w:before="360" w:after="360"/>
+        <w:pBdr>
+          <w:bottom w:val="single" w:sz="6" w:space="1" w:color="999999"/>
+        </w:pBdr>
+      </w:pPr>
     </w:p>
     <w:p>
       <w:pPr>
@@ -1696,15 +1668,11 @@
     </w:p>
     <w:p>
       <w:pPr>
-        <w:spacing w:after="240"/>
-      </w:pPr>
-      <w:r>
-        <w:rPr>
-          <w:color w:val="666666"/>
-          <w:sz w:val="16"/>
-        </w:rPr>
-        <w:t>────────────────────────────────────────────────────────────────────────────────</w:t>
-      </w:r>
+        <w:spacing w:before="360" w:after="360"/>
+        <w:pBdr>
+          <w:bottom w:val="single" w:sz="6" w:space="1" w:color="999999"/>
+        </w:pBdr>
+      </w:pPr>
     </w:p>
     <w:p>
       <w:pPr>
@@ -1833,15 +1801,11 @@
     </w:p>
     <w:p>
       <w:pPr>
-        <w:spacing w:after="240"/>
-      </w:pPr>
-      <w:r>
-        <w:rPr>
-          <w:color w:val="666666"/>
-          <w:sz w:val="16"/>
-        </w:rPr>
-        <w:t>────────────────────────────────────────────────────────────────────────────────</w:t>
-      </w:r>
+        <w:spacing w:before="360" w:after="360"/>
+        <w:pBdr>
+          <w:bottom w:val="single" w:sz="6" w:space="1" w:color="999999"/>
+        </w:pBdr>
+      </w:pPr>
     </w:p>
     <w:p>
       <w:pPr>
@@ -2447,15 +2411,11 @@
     </w:p>
     <w:p>
       <w:pPr>
-        <w:spacing w:after="240"/>
-      </w:pPr>
-      <w:r>
-        <w:rPr>
-          <w:color w:val="666666"/>
-          <w:sz w:val="16"/>
-        </w:rPr>
-        <w:t>────────────────────────────────────────────────────────────────────────────────</w:t>
-      </w:r>
+        <w:spacing w:before="360" w:after="360"/>
+        <w:pBdr>
+          <w:bottom w:val="single" w:sz="6" w:space="1" w:color="999999"/>
+        </w:pBdr>
+      </w:pPr>
     </w:p>
     <w:p>
       <w:pPr>
@@ -2671,15 +2631,11 @@
     </w:p>
     <w:p>
       <w:pPr>
-        <w:spacing w:after="240"/>
-      </w:pPr>
-      <w:r>
-        <w:rPr>
-          <w:color w:val="666666"/>
-          <w:sz w:val="16"/>
-        </w:rPr>
-        <w:t>────────────────────────────────────────────────────────────────────────────────</w:t>
-      </w:r>
+        <w:spacing w:before="360" w:after="360"/>
+        <w:pBdr>
+          <w:bottom w:val="single" w:sz="6" w:space="1" w:color="999999"/>
+        </w:pBdr>
+      </w:pPr>
     </w:p>
     <w:p>
       <w:pPr>
@@ -3074,15 +3030,11 @@
     <w:p/>
     <w:p>
       <w:pPr>
-        <w:spacing w:after="240"/>
-      </w:pPr>
-      <w:r>
-        <w:rPr>
-          <w:color w:val="666666"/>
-          <w:sz w:val="16"/>
-        </w:rPr>
-        <w:t>────────────────────────────────────────────────────────────────────────────────</w:t>
-      </w:r>
+        <w:spacing w:before="360" w:after="360"/>
+        <w:pBdr>
+          <w:bottom w:val="single" w:sz="6" w:space="1" w:color="999999"/>
+        </w:pBdr>
+      </w:pPr>
     </w:p>
     <w:p>
       <w:pPr>
@@ -3569,15 +3521,11 @@
     </w:p>
     <w:p>
       <w:pPr>
-        <w:spacing w:after="240"/>
-      </w:pPr>
-      <w:r>
-        <w:rPr>
-          <w:color w:val="666666"/>
-          <w:sz w:val="16"/>
-        </w:rPr>
-        <w:t>────────────────────────────────────────────────────────────────────────────────</w:t>
-      </w:r>
+        <w:spacing w:before="360" w:after="360"/>
+        <w:pBdr>
+          <w:bottom w:val="single" w:sz="6" w:space="1" w:color="999999"/>
+        </w:pBdr>
+      </w:pPr>
     </w:p>
     <w:p>
       <w:pPr>
@@ -3758,15 +3706,11 @@
     </w:p>
     <w:p>
       <w:pPr>
-        <w:spacing w:after="240"/>
-      </w:pPr>
-      <w:r>
-        <w:rPr>
-          <w:color w:val="666666"/>
-          <w:sz w:val="16"/>
-        </w:rPr>
-        <w:t>────────────────────────────────────────────────────────────────────────────────</w:t>
-      </w:r>
+        <w:spacing w:before="360" w:after="360"/>
+        <w:pBdr>
+          <w:bottom w:val="single" w:sz="6" w:space="1" w:color="999999"/>
+        </w:pBdr>
+      </w:pPr>
     </w:p>
     <w:p>
       <w:pPr>

</xml_diff>